<commit_message>
Add animations and tutorial; now general cards are unlocked in level 5
</commit_message>
<xml_diff>
--- a/自存/项目日志.docx
+++ b/自存/项目日志.docx
@@ -48,16 +48,38 @@
         <w:rPr>
           <w:rFonts w:hint="eastAsia"/>
         </w:rPr>
-        <w:t>急了，整半天整不出来，看来对godot确实是不太熟</w:t>
-      </w:r>
-    </w:p>
-    <w:p>
-      <w:r>
-        <w:rPr>
-          <w:rFonts w:hint="eastAsia"/>
-        </w:rPr>
-        <w:t>好的在经历千辛万苦之后终于改对了一个，大的还在后面呢。经验之谈：提前跟他说好了一定要用节点啊啊啊啊啊</w:t>
-      </w:r>
+        <w:t>急了，整半天整不出来，看来对</w:t>
+      </w:r>
+      <w:proofErr w:type="spellStart"/>
+      <w:r>
+        <w:rPr>
+          <w:rFonts w:hint="eastAsia"/>
+        </w:rPr>
+        <w:t>godot</w:t>
+      </w:r>
+      <w:proofErr w:type="spellEnd"/>
+      <w:r>
+        <w:rPr>
+          <w:rFonts w:hint="eastAsia"/>
+        </w:rPr>
+        <w:t>确实是不太熟</w:t>
+      </w:r>
+    </w:p>
+    <w:p>
+      <w:r>
+        <w:rPr>
+          <w:rFonts w:hint="eastAsia"/>
+        </w:rPr>
+        <w:t>好的在经历千辛万苦之后终于改对了一个，大的还在后面呢。经验之谈：提前跟他说好了一定要用节点</w:t>
+      </w:r>
+      <w:proofErr w:type="gramStart"/>
+      <w:r>
+        <w:rPr>
+          <w:rFonts w:hint="eastAsia"/>
+        </w:rPr>
+        <w:t>啊啊啊啊啊</w:t>
+      </w:r>
+      <w:proofErr w:type="gramEnd"/>
     </w:p>
     <w:p>
       <w:r>
@@ -81,15 +103,51 @@
         <w:rPr>
           <w:rFonts w:hint="eastAsia"/>
         </w:rPr>
-        <w:t>好的又改对了一些，接下来要开始啃battleui这一坨了，我好后悔啊！！</w:t>
-      </w:r>
-    </w:p>
-    <w:p>
-      <w:r>
-        <w:rPr>
-          <w:rFonts w:hint="eastAsia"/>
-        </w:rPr>
-        <w:t>他改的时候我也在想我到底该给游戏投入多少时间好，因为下周需要忙GenerationAI那个项目，我那个项目还没啥进展呢其实，听网课也不咋认真说实话，有的课可能需要重新再看，但是又很费时间，不过这次我得记笔记了。加油吧Avis</w:t>
+        <w:t>好的又改对了一些，接下来要开始啃</w:t>
+      </w:r>
+      <w:proofErr w:type="spellStart"/>
+      <w:r>
+        <w:rPr>
+          <w:rFonts w:hint="eastAsia"/>
+        </w:rPr>
+        <w:t>battleui</w:t>
+      </w:r>
+      <w:proofErr w:type="spellEnd"/>
+      <w:r>
+        <w:rPr>
+          <w:rFonts w:hint="eastAsia"/>
+        </w:rPr>
+        <w:t>这一坨了，我好后悔</w:t>
+      </w:r>
+      <w:proofErr w:type="gramStart"/>
+      <w:r>
+        <w:rPr>
+          <w:rFonts w:hint="eastAsia"/>
+        </w:rPr>
+        <w:t>啊！！</w:t>
+      </w:r>
+      <w:proofErr w:type="gramEnd"/>
+    </w:p>
+    <w:p>
+      <w:r>
+        <w:rPr>
+          <w:rFonts w:hint="eastAsia"/>
+        </w:rPr>
+        <w:t>他改的时候我也在想我到底该给游戏投入多少时间好，因为下周需要忙</w:t>
+      </w:r>
+      <w:proofErr w:type="spellStart"/>
+      <w:r>
+        <w:rPr>
+          <w:rFonts w:hint="eastAsia"/>
+        </w:rPr>
+        <w:t>GenerationAI</w:t>
+      </w:r>
+      <w:proofErr w:type="spellEnd"/>
+      <w:r>
+        <w:rPr>
+          <w:rFonts w:hint="eastAsia"/>
+        </w:rPr>
+        <w:t>那个项目，我那个项目还没啥进展呢其实，听网课也不咋认真说实话，有的课可能需要重新再看，但是又很费时间，不过这次我得记笔记了。加油吧Avis</w:t>
       </w:r>
     </w:p>
     <w:p>
@@ -103,8 +161,16 @@
         <w:rPr>
           <w:rFonts w:hint="eastAsia"/>
         </w:rPr>
-        <w:t>和左下角信息框拆出来了，但是最恶心的还在后面，现在好像已经开始出问题了，我有一种不祥的预感。而且额度快爆了啊啊啊</w:t>
-      </w:r>
+        <w:t>和左下角信息框拆出来了，但是最恶心的还在后面，现在好像已经开始出问题了，我有一种不祥的预感。而且额度快爆了</w:t>
+      </w:r>
+      <w:proofErr w:type="gramStart"/>
+      <w:r>
+        <w:rPr>
+          <w:rFonts w:hint="eastAsia"/>
+        </w:rPr>
+        <w:t>啊啊啊</w:t>
+      </w:r>
+      <w:proofErr w:type="gramEnd"/>
     </w:p>
     <w:p>
       <w:r>
@@ -161,8 +227,16 @@
         <w:rPr>
           <w:rFonts w:hint="eastAsia"/>
         </w:rPr>
-        <w:t>这啥阴？。</w:t>
-      </w:r>
+        <w:t>这啥阴</w:t>
+      </w:r>
+      <w:proofErr w:type="gramStart"/>
+      <w:r>
+        <w:rPr>
+          <w:rFonts w:hint="eastAsia"/>
+        </w:rPr>
+        <w:t>？。</w:t>
+      </w:r>
+      <w:proofErr w:type="gramEnd"/>
       <w:r>
         <w:rPr>
           <w:noProof/>
@@ -215,7 +289,29 @@
         <w:rPr>
           <w:rFonts w:hint="eastAsia"/>
         </w:rPr>
-        <w:t>是用的powershell..?然后</w:t>
+        <w:t>是用的</w:t>
+      </w:r>
+      <w:proofErr w:type="spellStart"/>
+      <w:r>
+        <w:rPr>
+          <w:rFonts w:hint="eastAsia"/>
+        </w:rPr>
+        <w:t>powershell</w:t>
+      </w:r>
+      <w:proofErr w:type="spellEnd"/>
+      <w:proofErr w:type="gramStart"/>
+      <w:r>
+        <w:rPr>
+          <w:rFonts w:hint="eastAsia"/>
+        </w:rPr>
+        <w:t>..?</w:t>
+      </w:r>
+      <w:proofErr w:type="gramEnd"/>
+      <w:r>
+        <w:rPr>
+          <w:rFonts w:hint="eastAsia"/>
+        </w:rPr>
+        <w:t>然后</w:t>
       </w:r>
       <w:r>
         <w:rPr>
@@ -262,7 +358,21 @@
         <w:rPr>
           <w:rFonts w:hint="eastAsia"/>
         </w:rPr>
-        <w:t>问题不大还好我们在github上保存了一次，我现在要开个分支然后去写作业了</w:t>
+        <w:t>问题不大还好我们在</w:t>
+      </w:r>
+      <w:proofErr w:type="spellStart"/>
+      <w:r>
+        <w:rPr>
+          <w:rFonts w:hint="eastAsia"/>
+        </w:rPr>
+        <w:t>github</w:t>
+      </w:r>
+      <w:proofErr w:type="spellEnd"/>
+      <w:r>
+        <w:rPr>
+          <w:rFonts w:hint="eastAsia"/>
+        </w:rPr>
+        <w:t>上保存了一次，我现在要开个分支然后去写作业了</w:t>
       </w:r>
     </w:p>
     <w:p>
@@ -315,14 +425,44 @@
         <w:rPr>
           <w:rFonts w:hint="eastAsia"/>
         </w:rPr>
-        <w:t>生成了两只，继续继续，然后codex这边让它调调怪的站位，生图在用gpt本体的额度。</w:t>
+        <w:t>生成了两只，继续继续，然后codex这边让它调调怪的站位，生图在用</w:t>
+      </w:r>
+      <w:proofErr w:type="spellStart"/>
+      <w:r>
+        <w:rPr>
+          <w:rFonts w:hint="eastAsia"/>
+        </w:rPr>
+        <w:t>gpt</w:t>
+      </w:r>
+      <w:proofErr w:type="spellEnd"/>
+      <w:r>
+        <w:rPr>
+          <w:rFonts w:hint="eastAsia"/>
+        </w:rPr>
+        <w:t>本体的额度。</w:t>
       </w:r>
       <w:r>
         <w:rPr>
           <w:rFonts w:hint="eastAsia"/>
           <w:strike/>
         </w:rPr>
-        <w:t>Divide et impera!</w:t>
+        <w:t xml:space="preserve">Divide et </w:t>
+      </w:r>
+      <w:proofErr w:type="spellStart"/>
+      <w:r>
+        <w:rPr>
+          <w:rFonts w:hint="eastAsia"/>
+          <w:strike/>
+        </w:rPr>
+        <w:t>impera</w:t>
+      </w:r>
+      <w:proofErr w:type="spellEnd"/>
+      <w:r>
+        <w:rPr>
+          <w:rFonts w:hint="eastAsia"/>
+          <w:strike/>
+        </w:rPr>
+        <w:t>!</w:t>
       </w:r>
     </w:p>
     <w:p>
@@ -1621,8 +1761,16 @@
           <w:rFonts w:hint="eastAsia"/>
         </w:rPr>
         <w:lastRenderedPageBreak/>
-        <w:t>了，总之测试版暂且就这样了，产能不足哇！！！</w:t>
-      </w:r>
+        <w:t>了，总之测试版暂且就这样了，产能不足</w:t>
+      </w:r>
+      <w:proofErr w:type="gramStart"/>
+      <w:r>
+        <w:rPr>
+          <w:rFonts w:hint="eastAsia"/>
+        </w:rPr>
+        <w:t>哇！！！</w:t>
+      </w:r>
+      <w:proofErr w:type="gramEnd"/>
     </w:p>
     <w:p>
       <w:r>
@@ -1745,8 +1893,16 @@
         <w:rPr>
           <w:rFonts w:hint="eastAsia"/>
         </w:rPr>
-        <w:t>调整图片费死劲了，哎哟。。。</w:t>
-      </w:r>
+        <w:t>调整图片费死劲了，</w:t>
+      </w:r>
+      <w:proofErr w:type="gramStart"/>
+      <w:r>
+        <w:rPr>
+          <w:rFonts w:hint="eastAsia"/>
+        </w:rPr>
+        <w:t>哎哟。。。</w:t>
+      </w:r>
+      <w:proofErr w:type="gramEnd"/>
     </w:p>
     <w:p>
       <w:r>
@@ -1799,7 +1955,21 @@
         <w:rPr>
           <w:rFonts w:hint="eastAsia"/>
         </w:rPr>
-        <w:t>今天微调了一点东西，现在开始新游戏的时候只会解锁βudding了</w:t>
+        <w:t>今天微调了一点东西，现在开始新游戏的时候只会解锁β</w:t>
+      </w:r>
+      <w:proofErr w:type="spellStart"/>
+      <w:r>
+        <w:rPr>
+          <w:rFonts w:hint="eastAsia"/>
+        </w:rPr>
+        <w:t>udding</w:t>
+      </w:r>
+      <w:proofErr w:type="spellEnd"/>
+      <w:r>
+        <w:rPr>
+          <w:rFonts w:hint="eastAsia"/>
+        </w:rPr>
+        <w:t>了</w:t>
       </w:r>
     </w:p>
     <w:p>
@@ -1914,17 +2084,83 @@
       </w:r>
     </w:p>
     <w:p>
-      <w:pPr>
-        <w:rPr>
-          <w:rFonts w:hint="eastAsia"/>
-        </w:rPr>
-      </w:pPr>
-      <w:r>
-        <w:rPr>
-          <w:rFonts w:hint="eastAsia"/>
-        </w:rPr>
-        <w:t>然后gpt出了新模型，给codex装了godot mcp然后用terra改了一下style，现在终于可以在编辑器里改外观了，虽然说现在也还不是很想改</w:t>
-      </w:r>
+      <w:r>
+        <w:rPr>
+          <w:rFonts w:hint="eastAsia"/>
+        </w:rPr>
+        <w:t>然后</w:t>
+      </w:r>
+      <w:proofErr w:type="spellStart"/>
+      <w:r>
+        <w:rPr>
+          <w:rFonts w:hint="eastAsia"/>
+        </w:rPr>
+        <w:t>gpt</w:t>
+      </w:r>
+      <w:proofErr w:type="spellEnd"/>
+      <w:r>
+        <w:rPr>
+          <w:rFonts w:hint="eastAsia"/>
+        </w:rPr>
+        <w:t>出了新模型，给codex装了</w:t>
+      </w:r>
+      <w:proofErr w:type="spellStart"/>
+      <w:r>
+        <w:rPr>
+          <w:rFonts w:hint="eastAsia"/>
+        </w:rPr>
+        <w:t>godot</w:t>
+      </w:r>
+      <w:proofErr w:type="spellEnd"/>
+      <w:r>
+        <w:rPr>
+          <w:rFonts w:hint="eastAsia"/>
+        </w:rPr>
+        <w:t xml:space="preserve"> </w:t>
+      </w:r>
+      <w:proofErr w:type="spellStart"/>
+      <w:r>
+        <w:rPr>
+          <w:rFonts w:hint="eastAsia"/>
+        </w:rPr>
+        <w:t>mcp</w:t>
+      </w:r>
+      <w:proofErr w:type="spellEnd"/>
+      <w:r>
+        <w:rPr>
+          <w:rFonts w:hint="eastAsia"/>
+        </w:rPr>
+        <w:t>然后用terra改了一下style，现在终于可以在编辑器里改外观了，虽然说现在也还不是很想改</w:t>
+      </w:r>
+    </w:p>
+    <w:p>
+      <w:r>
+        <w:rPr>
+          <w:rFonts w:hint="eastAsia"/>
+        </w:rPr>
+        <w:t>2026.10.7</w:t>
+      </w:r>
+    </w:p>
+    <w:p>
+      <w:r>
+        <w:rPr>
+          <w:rFonts w:hint="eastAsia"/>
+        </w:rPr>
+        <w:t>最近在继续做CCFT1了，国庆做了一些动画，实装进游戏的效果是不错的</w:t>
+      </w:r>
+      <w:r>
+        <w:rPr>
+          <w:rFonts w:hint="eastAsia"/>
+        </w:rPr>
+        <w:t>，也解决了一个遗留问题，6.1sol确实要比六月那会强不少了</w:t>
+      </w:r>
+    </w:p>
+    <w:p>
+      <w:pPr>
+        <w:rPr>
+          <w:rFonts w:hint="eastAsia"/>
+        </w:rPr>
+      </w:pPr>
     </w:p>
     <w:sectPr>
       <w:pgSz w:w="11906" w:h="16838"/>

</xml_diff>

<commit_message>
Added level5, David's stall, changed some descriptions, rework βudding's and Rabbert Einstein's cards
</commit_message>
<xml_diff>
--- a/自存/项目日志.docx
+++ b/自存/项目日志.docx
@@ -70,16 +70,8 @@
         <w:rPr>
           <w:rFonts w:hint="eastAsia"/>
         </w:rPr>
-        <w:t>好的在经历千辛万苦之后终于改对了一个，大的还在后面呢。经验之谈：提前跟他说好了一定要用节点</w:t>
-      </w:r>
-      <w:proofErr w:type="gramStart"/>
-      <w:r>
-        <w:rPr>
-          <w:rFonts w:hint="eastAsia"/>
-        </w:rPr>
-        <w:t>啊啊啊啊啊</w:t>
-      </w:r>
-      <w:proofErr w:type="gramEnd"/>
+        <w:t>好的在经历千辛万苦之后终于改对了一个，大的还在后面呢。经验之谈：提前跟他说好了一定要用节点啊啊啊啊啊</w:t>
+      </w:r>
     </w:p>
     <w:p>
       <w:r>
@@ -117,16 +109,8 @@
         <w:rPr>
           <w:rFonts w:hint="eastAsia"/>
         </w:rPr>
-        <w:t>这一坨了，我好后悔</w:t>
-      </w:r>
-      <w:proofErr w:type="gramStart"/>
-      <w:r>
-        <w:rPr>
-          <w:rFonts w:hint="eastAsia"/>
-        </w:rPr>
-        <w:t>啊！！</w:t>
-      </w:r>
-      <w:proofErr w:type="gramEnd"/>
+        <w:t>这一坨了，我好后悔啊！！</w:t>
+      </w:r>
     </w:p>
     <w:p>
       <w:r>
@@ -161,16 +145,8 @@
         <w:rPr>
           <w:rFonts w:hint="eastAsia"/>
         </w:rPr>
-        <w:t>和左下角信息框拆出来了，但是最恶心的还在后面，现在好像已经开始出问题了，我有一种不祥的预感。而且额度快爆了</w:t>
-      </w:r>
-      <w:proofErr w:type="gramStart"/>
-      <w:r>
-        <w:rPr>
-          <w:rFonts w:hint="eastAsia"/>
-        </w:rPr>
-        <w:t>啊啊啊</w:t>
-      </w:r>
-      <w:proofErr w:type="gramEnd"/>
+        <w:t>和左下角信息框拆出来了，但是最恶心的还在后面，现在好像已经开始出问题了，我有一种不祥的预感。而且额度快爆了啊啊啊</w:t>
+      </w:r>
     </w:p>
     <w:p>
       <w:r>
@@ -227,16 +203,8 @@
         <w:rPr>
           <w:rFonts w:hint="eastAsia"/>
         </w:rPr>
-        <w:t>这啥阴</w:t>
-      </w:r>
-      <w:proofErr w:type="gramStart"/>
-      <w:r>
-        <w:rPr>
-          <w:rFonts w:hint="eastAsia"/>
-        </w:rPr>
-        <w:t>？。</w:t>
-      </w:r>
-      <w:proofErr w:type="gramEnd"/>
+        <w:t>这啥阴？。</w:t>
+      </w:r>
       <w:r>
         <w:rPr>
           <w:noProof/>
@@ -299,19 +267,11 @@
         <w:t>powershell</w:t>
       </w:r>
       <w:proofErr w:type="spellEnd"/>
-      <w:proofErr w:type="gramStart"/>
-      <w:r>
-        <w:rPr>
-          <w:rFonts w:hint="eastAsia"/>
-        </w:rPr>
-        <w:t>..?</w:t>
-      </w:r>
-      <w:proofErr w:type="gramEnd"/>
-      <w:r>
-        <w:rPr>
-          <w:rFonts w:hint="eastAsia"/>
-        </w:rPr>
-        <w:t>然后</w:t>
+      <w:r>
+        <w:rPr>
+          <w:rFonts w:hint="eastAsia"/>
+        </w:rPr>
+        <w:t>..?然后</w:t>
       </w:r>
       <w:r>
         <w:rPr>
@@ -1761,16 +1721,8 @@
           <w:rFonts w:hint="eastAsia"/>
         </w:rPr>
         <w:lastRenderedPageBreak/>
-        <w:t>了，总之测试版暂且就这样了，产能不足</w:t>
-      </w:r>
-      <w:proofErr w:type="gramStart"/>
-      <w:r>
-        <w:rPr>
-          <w:rFonts w:hint="eastAsia"/>
-        </w:rPr>
-        <w:t>哇！！！</w:t>
-      </w:r>
-      <w:proofErr w:type="gramEnd"/>
+        <w:t>了，总之测试版暂且就这样了，产能不足哇！！！</w:t>
+      </w:r>
     </w:p>
     <w:p>
       <w:r>
@@ -1893,16 +1845,8 @@
         <w:rPr>
           <w:rFonts w:hint="eastAsia"/>
         </w:rPr>
-        <w:t>调整图片费死劲了，</w:t>
-      </w:r>
-      <w:proofErr w:type="gramStart"/>
-      <w:r>
-        <w:rPr>
-          <w:rFonts w:hint="eastAsia"/>
-        </w:rPr>
-        <w:t>哎哟。。。</w:t>
-      </w:r>
-      <w:proofErr w:type="gramEnd"/>
+        <w:t>调整图片费死劲了，哎哟。。。</w:t>
+      </w:r>
     </w:p>
     <w:p>
       <w:r>
@@ -2161,6 +2105,33 @@
           <w:rFonts w:hint="eastAsia"/>
         </w:rPr>
       </w:pPr>
+      <w:r>
+        <w:rPr>
+          <w:rFonts w:hint="eastAsia"/>
+        </w:rPr>
+        <w:t>增加了新手教程（不完整）</w:t>
+      </w:r>
+    </w:p>
+    <w:p>
+      <w:r>
+        <w:rPr>
+          <w:rFonts w:hint="eastAsia"/>
+        </w:rPr>
+        <w:t>2026.10.8</w:t>
+      </w:r>
+    </w:p>
+    <w:p>
+      <w:pPr>
+        <w:rPr>
+          <w:rFonts w:hint="eastAsia"/>
+        </w:rPr>
+      </w:pPr>
+      <w:r>
+        <w:rPr>
+          <w:rFonts w:hint="eastAsia"/>
+        </w:rPr>
+        <w:t>更新了第五关，按计划移除了前四关的通用卡和局内商店，并在第五关（locker）解锁David小铺</w:t>
+      </w:r>
     </w:p>
     <w:sectPr>
       <w:pgSz w:w="11906" w:h="16838"/>

</xml_diff>